<commit_message>
Publish compact LEEDS model workbench and documentation sidebar
</commit_message>
<xml_diff>
--- a/projects/leeds_model/evidence/evidence/output/html/appendices/2026-09-30-model-description-revised.docx
+++ b/projects/leeds_model/evidence/evidence/output/html/appendices/2026-09-30-model-description-revised.docx
@@ -228,7 +228,7 @@
               <w:rPr>
                 <w:rStyle w:val="VerbatimChar"/>
               </w:rPr>
-              <w:t xml:space="preserve">data/canonical_initial_state.xlsx</w:t>
+              <w:t xml:space="preserve">data/initial_state/canonical_initial_state.xlsx</w:t>
             </w:r>
             <w:r>
               <w:t xml:space="preserve">. Its external closure</w:t>
@@ -283,7 +283,7 @@
               <w:rPr>
                 <w:rStyle w:val="VerbatimChar"/>
               </w:rPr>
-              <w:t xml:space="preserve">data/canonical_initial_state_North_South.xlsx</w:t>
+              <w:t xml:space="preserve">data/initial_state/canonical_initial_state_North_South.xlsx</w:t>
             </w:r>
             <w:r>
               <w:t xml:space="preserve">), which was calibrated on 1 October; see Calibration.</w:t>
@@ -30675,9 +30675,9 @@
         <w:tblLook w:firstRow="1" w:lastRow="0" w:firstColumn="0" w:lastColumn="0" w:noHBand="0" w:noVBand="0" w:val="0020"/>
       </w:tblPr>
       <w:tblGrid>
-        <w:gridCol w:w="1152"/>
-        <w:gridCol w:w="3312"/>
-        <w:gridCol w:w="3456"/>
+        <w:gridCol w:w="945"/>
+        <w:gridCol w:w="3428"/>
+        <w:gridCol w:w="3546"/>
       </w:tblGrid>
       <w:tr>
         <w:trPr>
@@ -30747,7 +30747,7 @@
               <w:t xml:space="preserve">revised</w:t>
             </w:r>
             <w:r>
-              <w:t xml:space="preserve">: stationary, calibrated</w:t>
+              <w:t xml:space="preserve">: stationary, calibrated · scenarios 12/12</w:t>
             </w:r>
           </w:p>
         </w:tc>
@@ -30765,7 +30765,7 @@
               <w:t xml:space="preserve">revised_ns</w:t>
             </w:r>
             <w:r>
-              <w:t xml:space="preserve">: stationary, calibrated</w:t>
+              <w:t xml:space="preserve">: stationary, calibrated · scenarios 12/12</w:t>
             </w:r>
           </w:p>
         </w:tc>
@@ -30797,7 +30797,7 @@
               <w:t xml:space="preserve">revised_openfix_fiat</w:t>
             </w:r>
             <w:r>
-              <w:t xml:space="preserve">: stationary baseline (knife-edge), calibrated</w:t>
+              <w:t xml:space="preserve">: stationary baseline (knife-edge), calibrated · scenarios 12/12</w:t>
             </w:r>
           </w:p>
         </w:tc>
@@ -30815,7 +30815,7 @@
               <w:t xml:space="preserve">revised_ns_openfix_fiat</w:t>
             </w:r>
             <w:r>
-              <w:t xml:space="preserve">: stationary baseline (knife-edge), calibrated</w:t>
+              <w:t xml:space="preserve">: stationary baseline (knife-edge), calibrated · scenarios 12/12</w:t>
             </w:r>
           </w:p>
         </w:tc>
@@ -30847,7 +30847,7 @@
               <w:t xml:space="preserve">revised_openfixg</w:t>
             </w:r>
             <w:r>
-              <w:t xml:space="preserve">: stationary</w:t>
+              <w:t xml:space="preserve">: stationary · scenarios 12/12</w:t>
             </w:r>
           </w:p>
         </w:tc>
@@ -30865,7 +30865,7 @@
               <w:t xml:space="preserve">revised_ns_openfixg</w:t>
             </w:r>
             <w:r>
-              <w:t xml:space="preserve">: stationary (South adjusts)</w:t>
+              <w:t xml:space="preserve">: stationary (South adjusts) · scenarios 12/12</w:t>
             </w:r>
           </w:p>
         </w:tc>
@@ -30897,7 +30897,7 @@
               <w:t xml:space="preserve">revised_quasifloat</w:t>
             </w:r>
             <w:r>
-              <w:t xml:space="preserve">: stationary baseline at par_xr 0.15</w:t>
+              <w:t xml:space="preserve">: stationary baseline at par_xr 0.15 · scenarios 12/12</w:t>
             </w:r>
           </w:p>
         </w:tc>
@@ -30915,7 +30915,7 @@
               <w:t xml:space="preserve">revised_ns_quasifloat</w:t>
             </w:r>
             <w:r>
-              <w:t xml:space="preserve">: stationary baseline at par_xr 0.15</w:t>
+              <w:t xml:space="preserve">: stationary baseline at par_xr 0.15 · scenarios 12/12</w:t>
             </w:r>
           </w:p>
         </w:tc>
@@ -34187,7 +34187,7 @@
         <w:rPr>
           <w:rStyle w:val="VerbatimChar"/>
         </w:rPr>
-        <w:t xml:space="preserve">data/target_values.xlsx</w:t>
+        <w:t xml:space="preserve">data/targets/target_values.xlsx</w:t>
       </w:r>
       <w:r>
         <w:t xml:space="preserve">). Five values were set</w:t>
@@ -35186,7 +35186,7 @@
         <w:rPr>
           <w:rStyle w:val="VerbatimChar"/>
         </w:rPr>
-        <w:t xml:space="preserve">tools/catalogue_cleanup_20261001.py</w:t>
+        <w:t xml:space="preserve">tools/equations/catalogue_cleanup_20261001.py</w:t>
       </w:r>
       <w:r>
         <w:t xml:space="preserve">). The</w:t>

</xml_diff>